<commit_message>
CV: restore all employers with project-delivery points only
Adds TQ Cert, Tata Power and KC Kopar roles back and the Pavagada
project at SECI, keeping quality/inspection content out. Khavda hybrid
added to the BESS portfolio. CV is now two pages.

Co-Authored-By: Claude Opus 5.5 <noreply@anthropic.com>
Claude-Session: https://claude.ai/code/session_01NprkEhCyrG1xp2mBYBwajH
</commit_message>
<xml_diff>
--- a/cv/Justin_Thomas_BESS_Project_Manager_CV.docx
+++ b/cv/Justin_Thomas_BESS_Project_Manager_CV.docx
@@ -65,7 +65,7 @@
     </w:p>
     <w:p>
       <w:r>
-        <w:t>Runs the complete BESS electrical package on the EPC contractor side: containerised battery systems, PCS, MV/HV balance of plant, EMS/SCADA and the 145 kV evacuation interface. Manages seven OEMs and suppliers, the Owner's Engineer and the client from drawing approval through site acceptance and closure. Earlier delivered a 1.4 MWh island BESS in Lakshadweep for SECI under tight logistical constraints.</w:t>
+        <w:t>Runs the complete BESS electrical package on the EPC contractor side: containerised battery systems, PCS, MV/HV balance of plant, EMS/SCADA and the 145 kV evacuation interface. Has worked on BESS from the EPC contractor, Owner's Engineer and government implementing agency sides, including a 500 MW BESS + solar hybrid at Khavda and a 1.4 MWh island BESS in Lakshadweep.</w:t>
       </w:r>
     </w:p>
     <w:p>
@@ -214,6 +214,60 @@
               <w:rPr>
                 <w:sz w:val="19"/>
               </w:rPr>
+              <w:t>Khavda BESS + Solar Hybrid</w:t>
+            </w:r>
+          </w:p>
+        </w:tc>
+        <w:tc>
+          <w:tcPr>
+            <w:tcW w:type="dxa" w:w="2523"/>
+          </w:tcPr>
+          <w:p>
+            <w:r>
+              <w:rPr>
+                <w:sz w:val="19"/>
+              </w:rPr>
+              <w:t>500 MW</w:t>
+            </w:r>
+          </w:p>
+        </w:tc>
+        <w:tc>
+          <w:tcPr>
+            <w:tcW w:type="dxa" w:w="2523"/>
+          </w:tcPr>
+          <w:p>
+            <w:r>
+              <w:rPr>
+                <w:sz w:val="19"/>
+              </w:rPr>
+              <w:t>Khavda, Gujarat</w:t>
+            </w:r>
+          </w:p>
+        </w:tc>
+        <w:tc>
+          <w:tcPr>
+            <w:tcW w:type="dxa" w:w="2523"/>
+          </w:tcPr>
+          <w:p>
+            <w:r>
+              <w:rPr>
+                <w:sz w:val="19"/>
+              </w:rPr>
+              <w:t>Owner's Engineer — TQ Cert (Tata Projects)</w:t>
+            </w:r>
+          </w:p>
+        </w:tc>
+      </w:tr>
+      <w:tr>
+        <w:tc>
+          <w:tcPr>
+            <w:tcW w:type="dxa" w:w="2523"/>
+          </w:tcPr>
+          <w:p>
+            <w:r>
+              <w:rPr>
+                <w:sz w:val="19"/>
+              </w:rPr>
               <w:t>Lakshadweep Island BESS</w:t>
             </w:r>
           </w:p>
@@ -272,7 +326,7 @@
           <w:color w:val="0B6E4F"/>
           <w:sz w:val="21"/>
         </w:rPr>
-        <w:t>BESS PROJECT EXPERIENCE</w:t>
+        <w:t>PROFESSIONAL EXPERIENCE</w:t>
       </w:r>
     </w:p>
     <w:p>
@@ -375,6 +429,139 @@
         <w:rPr>
           <w:b/>
         </w:rPr>
+        <w:t>Owner's Engineer</w:t>
+      </w:r>
+      <w:r>
+        <w:rPr>
+          <w:color w:val="5A6675"/>
+        </w:rPr>
+        <w:tab/>
+        <w:t>Aug 2023 – Aug 2025</w:t>
+      </w:r>
+    </w:p>
+    <w:p>
+      <w:r>
+        <w:rPr>
+          <w:b/>
+          <w:color w:val="5A6675"/>
+        </w:rPr>
+        <w:t>TQ Cert Services Pvt. Ltd. (Tata Projects Ltd.)</w:t>
+      </w:r>
+    </w:p>
+    <w:p>
+      <w:r>
+        <w:rPr>
+          <w:b/>
+        </w:rPr>
+        <w:t xml:space="preserve">Project: </w:t>
+      </w:r>
+      <w:r>
+        <w:rPr>
+          <w:sz w:val="19"/>
+        </w:rPr>
+        <w:t>500 MW BESS + solar hybrid, Khavda, Gujarat | 1,034 MW Siyambar / Bandha solar, Jaisalmer, Rajasthan.</w:t>
+      </w:r>
+    </w:p>
+    <w:p>
+      <w:pPr>
+        <w:pStyle w:val="ListBullet"/>
+        <w:spacing w:after="40"/>
+      </w:pPr>
+      <w:r>
+        <w:t>Represented the owner on a 500 MW BESS-plus-solar hybrid at Khavda and a 1,034 MW solar programme, among the largest renewable assets in the country, protecting owner interests across EPC contractor performance.</w:t>
+      </w:r>
+    </w:p>
+    <w:p>
+      <w:pPr>
+        <w:pStyle w:val="ListBullet"/>
+        <w:spacing w:after="40"/>
+      </w:pPr>
+      <w:r>
+        <w:t>Carried out design and drawing reviews and decided contractor deviation and concession requests on technical merit.</w:t>
+      </w:r>
+    </w:p>
+    <w:p>
+      <w:pPr>
+        <w:tabs>
+          <w:tab w:pos="10091" w:val="right"/>
+        </w:tabs>
+        <w:spacing w:before="80" w:after="0"/>
+      </w:pPr>
+      <w:r>
+        <w:rPr>
+          <w:b/>
+        </w:rPr>
+        <w:t>Project Lead</w:t>
+      </w:r>
+      <w:r>
+        <w:rPr>
+          <w:color w:val="5A6675"/>
+        </w:rPr>
+        <w:tab/>
+        <w:t>Aug 2022 – Aug 2023</w:t>
+      </w:r>
+    </w:p>
+    <w:p>
+      <w:r>
+        <w:rPr>
+          <w:b/>
+          <w:color w:val="5A6675"/>
+        </w:rPr>
+        <w:t>Tata Power Renewable Energy Ltd. (TP Solapur / TPREL)</w:t>
+      </w:r>
+    </w:p>
+    <w:p>
+      <w:r>
+        <w:rPr>
+          <w:b/>
+        </w:rPr>
+        <w:t xml:space="preserve">Project: </w:t>
+      </w:r>
+      <w:r>
+        <w:rPr>
+          <w:sz w:val="19"/>
+        </w:rPr>
+        <w:t>450 MWp / 335 MW AC solar, Bikaner, Rajasthan | 300 MW solar, Dholera, Gujarat | EV charging operations.</w:t>
+      </w:r>
+    </w:p>
+    <w:p>
+      <w:pPr>
+        <w:pStyle w:val="ListBullet"/>
+        <w:spacing w:after="40"/>
+      </w:pPr>
+      <w:r>
+        <w:t>Led developer-side project execution across roughly 750 MW of utility-scale solar in two states, managing EPC contractors against schedule and safety commitments on behalf of the asset owner.</w:t>
+      </w:r>
+    </w:p>
+    <w:p>
+      <w:pPr>
+        <w:pStyle w:val="ListBullet"/>
+        <w:spacing w:after="40"/>
+      </w:pPr>
+      <w:r>
+        <w:t>Tracked progress through site reviews, milestone verification and punch-list closure, driving contractors to commissioning and commercial operation readiness.</w:t>
+      </w:r>
+    </w:p>
+    <w:p>
+      <w:pPr>
+        <w:pStyle w:val="ListBullet"/>
+        <w:spacing w:after="40"/>
+      </w:pPr>
+      <w:r>
+        <w:t>Coordinated engineering, procurement, contracts, HSE and O&amp;M functions to resolve interface issues and keep multi-package sites in sequence.</w:t>
+      </w:r>
+    </w:p>
+    <w:p>
+      <w:pPr>
+        <w:tabs>
+          <w:tab w:pos="10091" w:val="right"/>
+        </w:tabs>
+        <w:spacing w:before="80" w:after="0"/>
+      </w:pPr>
+      <w:r>
+        <w:rPr>
+          <w:b/>
+        </w:rPr>
         <w:t>Project Engineer — Implementation</w:t>
       </w:r>
       <w:r>
@@ -405,7 +592,7 @@
         <w:rPr>
           <w:sz w:val="19"/>
         </w:rPr>
-        <w:t>1.4 MWh island battery energy storage system, Lakshadweep (UT).</w:t>
+        <w:t>1.4 MWh island BESS, Lakshadweep | 2,050 MW Pavagada Solar Park, Karnataka.</w:t>
       </w:r>
     </w:p>
     <w:p>
@@ -423,7 +610,87 @@
         <w:spacing w:after="40"/>
       </w:pPr>
       <w:r>
-        <w:t>Worked within the central nodal agency's policy, tendering and stakeholder framework, a perspective that now informs contract-aware BESS project decisions and bid-stage technical scrutiny.</w:t>
+        <w:t>Supported implementation of the 2,050 MW Pavagada Solar Park, one of the world's largest solar parks, monitoring developer and contractor delivery against scheme milestones on behalf of the central nodal agency.</w:t>
+      </w:r>
+    </w:p>
+    <w:p>
+      <w:pPr>
+        <w:pStyle w:val="ListBullet"/>
+        <w:spacing w:after="40"/>
+      </w:pPr>
+      <w:r>
+        <w:t>Built the policy, tendering and stakeholder perspective that now informs bid-stage technical scrutiny and contract-aware project decisions.</w:t>
+      </w:r>
+    </w:p>
+    <w:p>
+      <w:pPr>
+        <w:tabs>
+          <w:tab w:pos="10091" w:val="right"/>
+        </w:tabs>
+        <w:spacing w:before="80" w:after="0"/>
+      </w:pPr>
+      <w:r>
+        <w:rPr>
+          <w:b/>
+        </w:rPr>
+        <w:t>Electrical Engineer — Execution &amp; O&amp;M</w:t>
+      </w:r>
+      <w:r>
+        <w:rPr>
+          <w:color w:val="5A6675"/>
+        </w:rPr>
+        <w:tab/>
+        <w:t>Jun 2015 – Oct 2020</w:t>
+      </w:r>
+    </w:p>
+    <w:p>
+      <w:r>
+        <w:rPr>
+          <w:b/>
+          <w:color w:val="5A6675"/>
+        </w:rPr>
+        <w:t>KC Kopar Energy Solutions</w:t>
+      </w:r>
+    </w:p>
+    <w:p>
+      <w:r>
+        <w:rPr>
+          <w:b/>
+        </w:rPr>
+        <w:t xml:space="preserve">Project: </w:t>
+      </w:r>
+      <w:r>
+        <w:rPr>
+          <w:sz w:val="19"/>
+        </w:rPr>
+        <w:t>25.4 MW solar installation at Cochin International Airport Ltd. (CIAL), the world's first fully solar-powered airport.</w:t>
+      </w:r>
+    </w:p>
+    <w:p>
+      <w:pPr>
+        <w:pStyle w:val="ListBullet"/>
+        <w:spacing w:after="40"/>
+      </w:pPr>
+      <w:r>
+        <w:t>Executed 25.4 MW of solar generation across ground-mount, rooftop and canopy installations within a live, security-controlled airport environment.</w:t>
+      </w:r>
+    </w:p>
+    <w:p>
+      <w:pPr>
+        <w:pStyle w:val="ListBullet"/>
+        <w:spacing w:after="40"/>
+      </w:pPr>
+      <w:r>
+        <w:t>Managed installation, testing and commissioning of modules, inverters, LT/HT switchgear, transformers and evacuation infrastructure, coordinating with airport operations to protect uninterrupted service.</w:t>
+      </w:r>
+    </w:p>
+    <w:p>
+      <w:pPr>
+        <w:pStyle w:val="ListBullet"/>
+        <w:spacing w:after="40"/>
+      </w:pPr>
+      <w:r>
+        <w:t>Ran O&amp;M for the operating plant: preventive and breakdown maintenance, performance monitoring, fault diagnosis and generation reporting.</w:t>
       </w:r>
     </w:p>
     <w:p>

</xml_diff>